<commit_message>
prueba de pdf manifiesto
</commit_message>
<xml_diff>
--- a/templates/PLANTILLA_MANIFIESTO_WORD_PENDIENTE.docx
+++ b/templates/PLANTILLA_MANIFIESTO_WORD_PENDIENTE.docx
@@ -11638,26 +11638,6 @@
                 <w:rFonts w:ascii="Arial" w:hAnsi="Arial" w:cs="Arial"/>
               </w:rPr>
             </w:pPr>
-            <w:r>
-              <w:rPr>
-                <w:rFonts w:ascii="Arial" w:hAnsi="Arial" w:cs="Arial"/>
-              </w:rPr>
-              <w:t>{{</w:t>
-            </w:r>
-            <w:proofErr w:type="spellStart"/>
-            <w:r>
-              <w:rPr>
-                <w:rFonts w:ascii="Arial" w:hAnsi="Arial" w:cs="Arial"/>
-              </w:rPr>
-              <w:t>firma_generador</w:t>
-            </w:r>
-            <w:proofErr w:type="spellEnd"/>
-            <w:r>
-              <w:rPr>
-                <w:rFonts w:ascii="Arial" w:hAnsi="Arial" w:cs="Arial"/>
-              </w:rPr>
-              <w:t>}}</w:t>
-            </w:r>
           </w:p>
         </w:tc>
       </w:tr>
@@ -11788,26 +11768,6 @@
                 <w:rFonts w:ascii="Arial" w:hAnsi="Arial" w:cs="Arial"/>
               </w:rPr>
             </w:pPr>
-            <w:r>
-              <w:rPr>
-                <w:rFonts w:ascii="Arial" w:hAnsi="Arial" w:cs="Arial"/>
-              </w:rPr>
-              <w:t>{{</w:t>
-            </w:r>
-            <w:proofErr w:type="spellStart"/>
-            <w:r>
-              <w:rPr>
-                <w:rFonts w:ascii="Arial" w:hAnsi="Arial" w:cs="Arial"/>
-              </w:rPr>
-              <w:t>firma_transportista</w:t>
-            </w:r>
-            <w:proofErr w:type="spellEnd"/>
-            <w:r>
-              <w:rPr>
-                <w:rFonts w:ascii="Arial" w:hAnsi="Arial" w:cs="Arial"/>
-              </w:rPr>
-              <w:t>}}</w:t>
-            </w:r>
           </w:p>
         </w:tc>
       </w:tr>
@@ -14213,26 +14173,6 @@
                 <w:rFonts w:ascii="Arial" w:hAnsi="Arial" w:cs="Arial"/>
               </w:rPr>
             </w:pPr>
-            <w:r>
-              <w:rPr>
-                <w:rFonts w:ascii="Arial" w:hAnsi="Arial" w:cs="Arial"/>
-              </w:rPr>
-              <w:t>{{</w:t>
-            </w:r>
-            <w:proofErr w:type="spellStart"/>
-            <w:r>
-              <w:rPr>
-                <w:rFonts w:ascii="Arial" w:hAnsi="Arial" w:cs="Arial"/>
-              </w:rPr>
-              <w:t>firma_destino</w:t>
-            </w:r>
-            <w:proofErr w:type="spellEnd"/>
-            <w:r>
-              <w:rPr>
-                <w:rFonts w:ascii="Arial" w:hAnsi="Arial" w:cs="Arial"/>
-              </w:rPr>
-              <w:t>}}</w:t>
-            </w:r>
           </w:p>
         </w:tc>
       </w:tr>
@@ -16662,29 +16602,6 @@
                 <w:color w:val="000000" w:themeColor="text1"/>
               </w:rPr>
             </w:pPr>
-            <w:r>
-              <w:rPr>
-                <w:rFonts w:ascii="Arial" w:hAnsi="Arial" w:cs="Arial"/>
-                <w:color w:val="000000" w:themeColor="text1"/>
-              </w:rPr>
-              <w:t>{{</w:t>
-            </w:r>
-            <w:proofErr w:type="spellStart"/>
-            <w:r>
-              <w:rPr>
-                <w:rFonts w:ascii="Arial" w:hAnsi="Arial" w:cs="Arial"/>
-                <w:color w:val="000000" w:themeColor="text1"/>
-              </w:rPr>
-              <w:t>firma_representante_eors</w:t>
-            </w:r>
-            <w:proofErr w:type="spellEnd"/>
-            <w:r>
-              <w:rPr>
-                <w:rFonts w:ascii="Arial" w:hAnsi="Arial" w:cs="Arial"/>
-                <w:color w:val="000000" w:themeColor="text1"/>
-              </w:rPr>
-              <w:t>}}</w:t>
-            </w:r>
           </w:p>
         </w:tc>
       </w:tr>
@@ -17078,29 +16995,6 @@
                 <w:color w:val="000000" w:themeColor="text1"/>
               </w:rPr>
             </w:pPr>
-            <w:r>
-              <w:rPr>
-                <w:rFonts w:ascii="Arial" w:hAnsi="Arial" w:cs="Arial"/>
-                <w:color w:val="000000" w:themeColor="text1"/>
-              </w:rPr>
-              <w:t>{{</w:t>
-            </w:r>
-            <w:proofErr w:type="spellStart"/>
-            <w:r>
-              <w:rPr>
-                <w:rFonts w:ascii="Arial" w:hAnsi="Arial" w:cs="Arial"/>
-                <w:color w:val="000000" w:themeColor="text1"/>
-              </w:rPr>
-              <w:t>firma_responsable_generador</w:t>
-            </w:r>
-            <w:proofErr w:type="spellEnd"/>
-            <w:r>
-              <w:rPr>
-                <w:rFonts w:ascii="Arial" w:hAnsi="Arial" w:cs="Arial"/>
-                <w:color w:val="000000" w:themeColor="text1"/>
-              </w:rPr>
-              <w:t>}}</w:t>
-            </w:r>
           </w:p>
         </w:tc>
       </w:tr>

</xml_diff>